<commit_message>
feat: Add Source Code Analyzer - Java/JSP/XML analysis tool
- Backend: Python FastAPI for source code analysis
- Frontend: React UI for visualization
- Features: Extract functions, classes, methods, and XML elements
- Support: .java, .jsp, .xml file parsing
- API: POST /api/analyze endpoint for directory analysis
- KPI: Target 85% accuracy, ≤500ms response time
</commit_message>
<xml_diff>
--- a/prd_sourceanalysis.docx
+++ b/prd_sourceanalysis.docx
@@ -70,12 +70,21 @@
       <w:pPr>
         <w:spacing w:after="120"/>
       </w:pPr>
+      <w:proofErr w:type="spellStart"/>
       <w:r>
         <w:rPr>
           <w:b/>
           <w:bCs/>
         </w:rPr>
-        <w:t xml:space="preserve">팀명: </w:t>
+        <w:t>팀명</w:t>
+      </w:r>
+      <w:proofErr w:type="spellEnd"/>
+      <w:r>
+        <w:rPr>
+          <w:b/>
+          <w:bCs/>
+        </w:rPr>
+        <w:t xml:space="preserve">: </w:t>
       </w:r>
       <w:r>
         <w:t>[</w:t>
@@ -481,7 +490,25 @@
                 <w:sz w:val="20"/>
                 <w:szCs w:val="20"/>
               </w:rPr>
-              <w:t>[DEF 코퍼레이션]</w:t>
+              <w:t xml:space="preserve">[DEF </w:t>
+            </w:r>
+            <w:proofErr w:type="spellStart"/>
+            <w:r>
+              <w:rPr>
+                <w:color w:val="2C3E5A"/>
+                <w:sz w:val="20"/>
+                <w:szCs w:val="20"/>
+              </w:rPr>
+              <w:t>코퍼레이션</w:t>
+            </w:r>
+            <w:proofErr w:type="spellEnd"/>
+            <w:r>
+              <w:rPr>
+                <w:color w:val="2C3E5A"/>
+                <w:sz w:val="20"/>
+                <w:szCs w:val="20"/>
+              </w:rPr>
+              <w:t>]</w:t>
             </w:r>
           </w:p>
         </w:tc>
@@ -774,8 +801,13 @@
         <w:pStyle w:val="2"/>
       </w:pPr>
       <w:r>
-        <w:t>02. 어떤 분야에 AI를 도입하려고 하는가</w:t>
-      </w:r>
+        <w:t xml:space="preserve">02. 어떤 분야에 AI를 도입하려고 </w:t>
+      </w:r>
+      <w:proofErr w:type="gramStart"/>
+      <w:r>
+        <w:t>하는가</w:t>
+      </w:r>
+      <w:proofErr w:type="gramEnd"/>
     </w:p>
     <w:p>
       <w:pPr>
@@ -807,8 +839,13 @@
         <w:pStyle w:val="2"/>
       </w:pPr>
       <w:r>
-        <w:t>03. 현재 어떤 문제가 있는가</w:t>
-      </w:r>
+        <w:t xml:space="preserve">03. 현재 어떤 문제가 </w:t>
+      </w:r>
+      <w:proofErr w:type="gramStart"/>
+      <w:r>
+        <w:t>있는가</w:t>
+      </w:r>
+      <w:proofErr w:type="gramEnd"/>
     </w:p>
     <w:p>
       <w:pPr>
@@ -910,8 +947,13 @@
         <w:pStyle w:val="2"/>
       </w:pPr>
       <w:r>
-        <w:t>04. 사용자는 누구인가</w:t>
-      </w:r>
+        <w:t xml:space="preserve">04. 사용자는 </w:t>
+      </w:r>
+      <w:proofErr w:type="gramStart"/>
+      <w:r>
+        <w:t>누구인가</w:t>
+      </w:r>
+      <w:proofErr w:type="gramEnd"/>
     </w:p>
     <w:p>
       <w:pPr>
@@ -930,7 +972,15 @@
         <w:t xml:space="preserve">이름: </w:t>
       </w:r>
       <w:r>
-        <w:t>[김구매 대리, 34세]</w:t>
+        <w:t>[</w:t>
+      </w:r>
+      <w:proofErr w:type="spellStart"/>
+      <w:r>
+        <w:t>김구매</w:t>
+      </w:r>
+      <w:proofErr w:type="spellEnd"/>
+      <w:r>
+        <w:t xml:space="preserve"> 대리, 34세]</w:t>
       </w:r>
     </w:p>
     <w:p>
@@ -1290,10 +1340,17 @@
                 <w:sz w:val="18"/>
                 <w:szCs w:val="18"/>
               </w:rPr>
-              <w:t xml:space="preserve">  C --&gt;|신규| D[생성]</w:t>
-            </w:r>
-          </w:p>
-          <w:p>
+              <w:t xml:space="preserve"> </w:t>
+            </w:r>
+            <w:r>
+              <w:rPr>
+                <w:rFonts w:ascii="Consolas" w:eastAsiaTheme="minorEastAsia" w:hAnsi="Consolas" w:cs="Consolas" w:hint="eastAsia"/>
+                <w:color w:val="B8D4FF"/>
+                <w:sz w:val="18"/>
+                <w:szCs w:val="18"/>
+              </w:rPr>
+              <w:t xml:space="preserve"> </w:t>
+            </w:r>
             <w:r>
               <w:rPr>
                 <w:rFonts w:ascii="Consolas" w:eastAsia="Consolas" w:hAnsi="Consolas" w:cs="Consolas"/>
@@ -1301,6 +1358,17 @@
                 <w:sz w:val="18"/>
                 <w:szCs w:val="18"/>
               </w:rPr>
+              <w:t>C --&gt;|신규| D[생성]</w:t>
+            </w:r>
+          </w:p>
+          <w:p>
+            <w:r>
+              <w:rPr>
+                <w:rFonts w:ascii="Consolas" w:eastAsia="Consolas" w:hAnsi="Consolas" w:cs="Consolas"/>
+                <w:color w:val="B8D4FF"/>
+                <w:sz w:val="18"/>
+                <w:szCs w:val="18"/>
+              </w:rPr>
               <w:t xml:space="preserve">  C --&gt;|기존| E[조회]</w:t>
             </w:r>
           </w:p>
@@ -1316,12 +1384,21 @@
       <w:pPr>
         <w:spacing w:after="120"/>
       </w:pPr>
+      <w:proofErr w:type="gramStart"/>
       <w:r>
         <w:rPr>
           <w:b/>
           <w:bCs/>
         </w:rPr>
-        <w:t>Step-by-step:</w:t>
+        <w:t>Step-by-step</w:t>
+      </w:r>
+      <w:proofErr w:type="gramEnd"/>
+      <w:r>
+        <w:rPr>
+          <w:b/>
+          <w:bCs/>
+        </w:rPr>
+        <w:t>:</w:t>
       </w:r>
     </w:p>
     <w:p>
@@ -1426,6 +1503,7 @@
             </w:tcMar>
           </w:tcPr>
           <w:p>
+            <w:proofErr w:type="gramStart"/>
             <w:r>
               <w:rPr>
                 <w:rFonts w:ascii="Consolas" w:eastAsia="Consolas" w:hAnsi="Consolas" w:cs="Consolas"/>
@@ -1433,10 +1511,9 @@
                 <w:sz w:val="18"/>
                 <w:szCs w:val="18"/>
               </w:rPr>
-              <w:t>+-----------------------+</w:t>
-            </w:r>
-          </w:p>
-          <w:p>
+              <w:t>+-</w:t>
+            </w:r>
+            <w:proofErr w:type="gramEnd"/>
             <w:r>
               <w:rPr>
                 <w:rFonts w:ascii="Consolas" w:eastAsia="Consolas" w:hAnsi="Consolas" w:cs="Consolas"/>
@@ -1444,10 +1521,11 @@
                 <w:sz w:val="18"/>
                 <w:szCs w:val="18"/>
               </w:rPr>
-              <w:t>|  제목       [+ 추가]  |</w:t>
-            </w:r>
-          </w:p>
-          <w:p>
+              <w:t>----------------------+</w:t>
+            </w:r>
+          </w:p>
+          <w:p>
+            <w:proofErr w:type="gramStart"/>
             <w:r>
               <w:rPr>
                 <w:rFonts w:ascii="Consolas" w:eastAsia="Consolas" w:hAnsi="Consolas" w:cs="Consolas"/>
@@ -1455,10 +1533,9 @@
                 <w:sz w:val="18"/>
                 <w:szCs w:val="18"/>
               </w:rPr>
-              <w:t>+-----------------------+</w:t>
-            </w:r>
-          </w:p>
-          <w:p>
+              <w:t>|  제목</w:t>
+            </w:r>
+            <w:proofErr w:type="gramEnd"/>
             <w:r>
               <w:rPr>
                 <w:rFonts w:ascii="Consolas" w:eastAsia="Consolas" w:hAnsi="Consolas" w:cs="Consolas"/>
@@ -1466,10 +1543,9 @@
                 <w:sz w:val="18"/>
                 <w:szCs w:val="18"/>
               </w:rPr>
-              <w:t>| [ ] 항목 A            |</w:t>
-            </w:r>
-          </w:p>
-          <w:p>
+              <w:t xml:space="preserve">       [+ 추가</w:t>
+            </w:r>
+            <w:proofErr w:type="gramStart"/>
             <w:r>
               <w:rPr>
                 <w:rFonts w:ascii="Consolas" w:eastAsia="Consolas" w:hAnsi="Consolas" w:cs="Consolas"/>
@@ -1477,10 +1553,12 @@
                 <w:sz w:val="18"/>
                 <w:szCs w:val="18"/>
               </w:rPr>
-              <w:t>| [ ] 항목 B            |</w:t>
-            </w:r>
-          </w:p>
-          <w:p>
+              <w:t>]  |</w:t>
+            </w:r>
+            <w:proofErr w:type="gramEnd"/>
+          </w:p>
+          <w:p>
+            <w:proofErr w:type="gramStart"/>
             <w:r>
               <w:rPr>
                 <w:rFonts w:ascii="Consolas" w:eastAsia="Consolas" w:hAnsi="Consolas" w:cs="Consolas"/>
@@ -1488,10 +1566,9 @@
                 <w:sz w:val="18"/>
                 <w:szCs w:val="18"/>
               </w:rPr>
-              <w:t>| [X] 항목 C (완료)     |</w:t>
-            </w:r>
-          </w:p>
-          <w:p>
+              <w:t>+-</w:t>
+            </w:r>
+            <w:proofErr w:type="gramEnd"/>
             <w:r>
               <w:rPr>
                 <w:rFonts w:ascii="Consolas" w:eastAsia="Consolas" w:hAnsi="Consolas" w:cs="Consolas"/>
@@ -1499,7 +1576,7 @@
                 <w:sz w:val="18"/>
                 <w:szCs w:val="18"/>
               </w:rPr>
-              <w:t>+-----------------------+</w:t>
+              <w:t>----------------------+</w:t>
             </w:r>
           </w:p>
           <w:p>
@@ -1510,10 +1587,9 @@
                 <w:sz w:val="18"/>
                 <w:szCs w:val="18"/>
               </w:rPr>
-              <w:t>| [전체][진행중][완료]  |</w:t>
-            </w:r>
-          </w:p>
-          <w:p>
+              <w:t xml:space="preserve">| </w:t>
+            </w:r>
+            <w:proofErr w:type="gramStart"/>
             <w:r>
               <w:rPr>
                 <w:rFonts w:ascii="Consolas" w:eastAsia="Consolas" w:hAnsi="Consolas" w:cs="Consolas"/>
@@ -1521,7 +1597,125 @@
                 <w:sz w:val="18"/>
                 <w:szCs w:val="18"/>
               </w:rPr>
-              <w:t>+-----------------------+</w:t>
+              <w:t>[ ]</w:t>
+            </w:r>
+            <w:proofErr w:type="gramEnd"/>
+            <w:r>
+              <w:rPr>
+                <w:rFonts w:ascii="Consolas" w:eastAsia="Consolas" w:hAnsi="Consolas" w:cs="Consolas"/>
+                <w:color w:val="B8D4FF"/>
+                <w:sz w:val="18"/>
+                <w:szCs w:val="18"/>
+              </w:rPr>
+              <w:t xml:space="preserve"> 항목 A            |</w:t>
+            </w:r>
+          </w:p>
+          <w:p>
+            <w:r>
+              <w:rPr>
+                <w:rFonts w:ascii="Consolas" w:eastAsia="Consolas" w:hAnsi="Consolas" w:cs="Consolas"/>
+                <w:color w:val="B8D4FF"/>
+                <w:sz w:val="18"/>
+                <w:szCs w:val="18"/>
+              </w:rPr>
+              <w:t xml:space="preserve">| </w:t>
+            </w:r>
+            <w:proofErr w:type="gramStart"/>
+            <w:r>
+              <w:rPr>
+                <w:rFonts w:ascii="Consolas" w:eastAsia="Consolas" w:hAnsi="Consolas" w:cs="Consolas"/>
+                <w:color w:val="B8D4FF"/>
+                <w:sz w:val="18"/>
+                <w:szCs w:val="18"/>
+              </w:rPr>
+              <w:t>[ ]</w:t>
+            </w:r>
+            <w:proofErr w:type="gramEnd"/>
+            <w:r>
+              <w:rPr>
+                <w:rFonts w:ascii="Consolas" w:eastAsia="Consolas" w:hAnsi="Consolas" w:cs="Consolas"/>
+                <w:color w:val="B8D4FF"/>
+                <w:sz w:val="18"/>
+                <w:szCs w:val="18"/>
+              </w:rPr>
+              <w:t xml:space="preserve"> 항목 B            |</w:t>
+            </w:r>
+          </w:p>
+          <w:p>
+            <w:r>
+              <w:rPr>
+                <w:rFonts w:ascii="Consolas" w:eastAsia="Consolas" w:hAnsi="Consolas" w:cs="Consolas"/>
+                <w:color w:val="B8D4FF"/>
+                <w:sz w:val="18"/>
+                <w:szCs w:val="18"/>
+              </w:rPr>
+              <w:t>| [X] 항목 C (완료)     |</w:t>
+            </w:r>
+          </w:p>
+          <w:p>
+            <w:proofErr w:type="gramStart"/>
+            <w:r>
+              <w:rPr>
+                <w:rFonts w:ascii="Consolas" w:eastAsia="Consolas" w:hAnsi="Consolas" w:cs="Consolas"/>
+                <w:color w:val="B8D4FF"/>
+                <w:sz w:val="18"/>
+                <w:szCs w:val="18"/>
+              </w:rPr>
+              <w:t>+-</w:t>
+            </w:r>
+            <w:proofErr w:type="gramEnd"/>
+            <w:r>
+              <w:rPr>
+                <w:rFonts w:ascii="Consolas" w:eastAsia="Consolas" w:hAnsi="Consolas" w:cs="Consolas"/>
+                <w:color w:val="B8D4FF"/>
+                <w:sz w:val="18"/>
+                <w:szCs w:val="18"/>
+              </w:rPr>
+              <w:t>----------------------+</w:t>
+            </w:r>
+          </w:p>
+          <w:p>
+            <w:r>
+              <w:rPr>
+                <w:rFonts w:ascii="Consolas" w:eastAsia="Consolas" w:hAnsi="Consolas" w:cs="Consolas"/>
+                <w:color w:val="B8D4FF"/>
+                <w:sz w:val="18"/>
+                <w:szCs w:val="18"/>
+              </w:rPr>
+              <w:t>| [전체][진행중][완료</w:t>
+            </w:r>
+            <w:proofErr w:type="gramStart"/>
+            <w:r>
+              <w:rPr>
+                <w:rFonts w:ascii="Consolas" w:eastAsia="Consolas" w:hAnsi="Consolas" w:cs="Consolas"/>
+                <w:color w:val="B8D4FF"/>
+                <w:sz w:val="18"/>
+                <w:szCs w:val="18"/>
+              </w:rPr>
+              <w:t>]  |</w:t>
+            </w:r>
+            <w:proofErr w:type="gramEnd"/>
+          </w:p>
+          <w:p>
+            <w:proofErr w:type="gramStart"/>
+            <w:r>
+              <w:rPr>
+                <w:rFonts w:ascii="Consolas" w:eastAsia="Consolas" w:hAnsi="Consolas" w:cs="Consolas"/>
+                <w:color w:val="B8D4FF"/>
+                <w:sz w:val="18"/>
+                <w:szCs w:val="18"/>
+              </w:rPr>
+              <w:t>+-</w:t>
+            </w:r>
+            <w:proofErr w:type="gramEnd"/>
+            <w:r>
+              <w:rPr>
+                <w:rFonts w:ascii="Consolas" w:eastAsia="Consolas" w:hAnsi="Consolas" w:cs="Consolas"/>
+                <w:color w:val="B8D4FF"/>
+                <w:sz w:val="18"/>
+                <w:szCs w:val="18"/>
+              </w:rPr>
+              <w:t>----------------------+</w:t>
             </w:r>
           </w:p>
         </w:tc>
@@ -1689,7 +1883,15 @@
         <w:t xml:space="preserve">프레임워크: </w:t>
       </w:r>
       <w:r>
-        <w:t>[FastAPI]</w:t>
+        <w:t>[</w:t>
+      </w:r>
+      <w:proofErr w:type="spellStart"/>
+      <w:r>
+        <w:t>FastAPI</w:t>
+      </w:r>
+      <w:proofErr w:type="spellEnd"/>
+      <w:r>
+        <w:t>]</w:t>
       </w:r>
     </w:p>
     <w:p>
@@ -1851,10 +2053,9 @@
                 <w:sz w:val="18"/>
                 <w:szCs w:val="18"/>
               </w:rPr>
-              <w:t>+- done: boolean (default F)</w:t>
-            </w:r>
-          </w:p>
-          <w:p>
+              <w:t xml:space="preserve">+- done: </w:t>
+            </w:r>
+            <w:proofErr w:type="spellStart"/>
             <w:r>
               <w:rPr>
                 <w:rFonts w:ascii="Consolas" w:eastAsia="Consolas" w:hAnsi="Consolas" w:cs="Consolas"/>
@@ -1862,7 +2063,48 @@
                 <w:sz w:val="18"/>
                 <w:szCs w:val="18"/>
               </w:rPr>
-              <w:t>+- user_id: UUID (FK)</w:t>
+              <w:t>boolean</w:t>
+            </w:r>
+            <w:proofErr w:type="spellEnd"/>
+            <w:r>
+              <w:rPr>
+                <w:rFonts w:ascii="Consolas" w:eastAsia="Consolas" w:hAnsi="Consolas" w:cs="Consolas"/>
+                <w:color w:val="B8D4FF"/>
+                <w:sz w:val="18"/>
+                <w:szCs w:val="18"/>
+              </w:rPr>
+              <w:t xml:space="preserve"> (default F)</w:t>
+            </w:r>
+          </w:p>
+          <w:p>
+            <w:r>
+              <w:rPr>
+                <w:rFonts w:ascii="Consolas" w:eastAsia="Consolas" w:hAnsi="Consolas" w:cs="Consolas"/>
+                <w:color w:val="B8D4FF"/>
+                <w:sz w:val="18"/>
+                <w:szCs w:val="18"/>
+              </w:rPr>
+              <w:t xml:space="preserve">+- </w:t>
+            </w:r>
+            <w:proofErr w:type="spellStart"/>
+            <w:r>
+              <w:rPr>
+                <w:rFonts w:ascii="Consolas" w:eastAsia="Consolas" w:hAnsi="Consolas" w:cs="Consolas"/>
+                <w:color w:val="B8D4FF"/>
+                <w:sz w:val="18"/>
+                <w:szCs w:val="18"/>
+              </w:rPr>
+              <w:t>user_id</w:t>
+            </w:r>
+            <w:proofErr w:type="spellEnd"/>
+            <w:r>
+              <w:rPr>
+                <w:rFonts w:ascii="Consolas" w:eastAsia="Consolas" w:hAnsi="Consolas" w:cs="Consolas"/>
+                <w:color w:val="B8D4FF"/>
+                <w:sz w:val="18"/>
+                <w:szCs w:val="18"/>
+              </w:rPr>
+              <w:t>: UUID (FK)</w:t>
             </w:r>
           </w:p>
         </w:tc>
@@ -1877,8 +2119,13 @@
       <w:pPr>
         <w:pStyle w:val="3"/>
       </w:pPr>
-      <w:r>
-        <w:t>비기능 요구사항</w:t>
+      <w:proofErr w:type="spellStart"/>
+      <w:r>
+        <w:t>비기능</w:t>
+      </w:r>
+      <w:proofErr w:type="spellEnd"/>
+      <w:r>
+        <w:t xml:space="preserve"> 요구사항</w:t>
       </w:r>
     </w:p>
     <w:p>
@@ -1999,7 +2246,15 @@
         <w:t xml:space="preserve">출처: </w:t>
       </w:r>
       <w:r>
-        <w:t>[어디서 얻는가 — 공개 API · 크롤링 · 합성 · 실제 회사 데이터]</w:t>
+        <w:t xml:space="preserve">[어디서 얻는가 — 공개 API · </w:t>
+      </w:r>
+      <w:proofErr w:type="spellStart"/>
+      <w:r>
+        <w:t>크롤링</w:t>
+      </w:r>
+      <w:proofErr w:type="spellEnd"/>
+      <w:r>
+        <w:t xml:space="preserve"> · 합성 · 실제 회사 데이터]</w:t>
       </w:r>
     </w:p>
     <w:p>
@@ -2284,7 +2539,43 @@
                 <w:sz w:val="20"/>
                 <w:szCs w:val="20"/>
               </w:rPr>
-              <w:t>[백엔드 스캐폴딩]</w:t>
+              <w:t>[</w:t>
+            </w:r>
+            <w:proofErr w:type="spellStart"/>
+            <w:r>
+              <w:rPr>
+                <w:color w:val="2C3E5A"/>
+                <w:sz w:val="20"/>
+                <w:szCs w:val="20"/>
+              </w:rPr>
+              <w:t>백엔드</w:t>
+            </w:r>
+            <w:proofErr w:type="spellEnd"/>
+            <w:r>
+              <w:rPr>
+                <w:color w:val="2C3E5A"/>
+                <w:sz w:val="20"/>
+                <w:szCs w:val="20"/>
+              </w:rPr>
+              <w:t xml:space="preserve"> </w:t>
+            </w:r>
+            <w:proofErr w:type="spellStart"/>
+            <w:r>
+              <w:rPr>
+                <w:color w:val="2C3E5A"/>
+                <w:sz w:val="20"/>
+                <w:szCs w:val="20"/>
+              </w:rPr>
+              <w:t>스캐폴딩</w:t>
+            </w:r>
+            <w:proofErr w:type="spellEnd"/>
+            <w:r>
+              <w:rPr>
+                <w:color w:val="2C3E5A"/>
+                <w:sz w:val="20"/>
+                <w:szCs w:val="20"/>
+              </w:rPr>
+              <w:t>]</w:t>
             </w:r>
           </w:p>
         </w:tc>
@@ -2421,7 +2712,25 @@
                 <w:sz w:val="20"/>
                 <w:szCs w:val="20"/>
               </w:rPr>
-              <w:t>[pytest 100% 통과]</w:t>
+              <w:t>[</w:t>
+            </w:r>
+            <w:proofErr w:type="spellStart"/>
+            <w:r>
+              <w:rPr>
+                <w:color w:val="2C3E5A"/>
+                <w:sz w:val="20"/>
+                <w:szCs w:val="20"/>
+              </w:rPr>
+              <w:t>pytest</w:t>
+            </w:r>
+            <w:proofErr w:type="spellEnd"/>
+            <w:r>
+              <w:rPr>
+                <w:color w:val="2C3E5A"/>
+                <w:sz w:val="20"/>
+                <w:szCs w:val="20"/>
+              </w:rPr>
+              <w:t xml:space="preserve"> 100% 통과]</w:t>
             </w:r>
           </w:p>
         </w:tc>
@@ -2505,7 +2814,25 @@
                 <w:sz w:val="20"/>
                 <w:szCs w:val="20"/>
               </w:rPr>
-              <w:t>[프론트엔드 연동]</w:t>
+              <w:t>[</w:t>
+            </w:r>
+            <w:proofErr w:type="spellStart"/>
+            <w:r>
+              <w:rPr>
+                <w:color w:val="2C3E5A"/>
+                <w:sz w:val="20"/>
+                <w:szCs w:val="20"/>
+              </w:rPr>
+              <w:t>프론트엔드</w:t>
+            </w:r>
+            <w:proofErr w:type="spellEnd"/>
+            <w:r>
+              <w:rPr>
+                <w:color w:val="2C3E5A"/>
+                <w:sz w:val="20"/>
+                <w:szCs w:val="20"/>
+              </w:rPr>
+              <w:t xml:space="preserve"> 연동]</w:t>
             </w:r>
           </w:p>
         </w:tc>
@@ -2787,7 +3114,25 @@
                 <w:sz w:val="20"/>
                 <w:szCs w:val="20"/>
               </w:rPr>
-              <w:t>[업무 시간 절감률]</w:t>
+              <w:t xml:space="preserve">[업무 시간 </w:t>
+            </w:r>
+            <w:proofErr w:type="spellStart"/>
+            <w:r>
+              <w:rPr>
+                <w:color w:val="2C3E5A"/>
+                <w:sz w:val="20"/>
+                <w:szCs w:val="20"/>
+              </w:rPr>
+              <w:t>절감률</w:t>
+            </w:r>
+            <w:proofErr w:type="spellEnd"/>
+            <w:r>
+              <w:rPr>
+                <w:color w:val="2C3E5A"/>
+                <w:sz w:val="20"/>
+                <w:szCs w:val="20"/>
+              </w:rPr>
+              <w:t>]</w:t>
             </w:r>
           </w:p>
         </w:tc>
@@ -3025,7 +3370,15 @@
         <w:pStyle w:val="2"/>
       </w:pPr>
       <w:r>
-        <w:t>12. 팀원별 역할 분담</w:t>
+        <w:t xml:space="preserve">12. </w:t>
+      </w:r>
+      <w:proofErr w:type="spellStart"/>
+      <w:r>
+        <w:t>팀원별</w:t>
+      </w:r>
+      <w:proofErr w:type="spellEnd"/>
+      <w:r>
+        <w:t xml:space="preserve"> 역할 분담</w:t>
       </w:r>
     </w:p>
     <w:tbl>
@@ -3171,7 +3524,29 @@
                 <w:sz w:val="20"/>
                 <w:szCs w:val="20"/>
               </w:rPr>
-              <w:t>Git 커밋 범위</w:t>
+              <w:t xml:space="preserve">Git </w:t>
+            </w:r>
+            <w:proofErr w:type="spellStart"/>
+            <w:r>
+              <w:rPr>
+                <w:b/>
+                <w:bCs/>
+                <w:color w:val="FFFFFF"/>
+                <w:sz w:val="20"/>
+                <w:szCs w:val="20"/>
+              </w:rPr>
+              <w:t>커밋</w:t>
+            </w:r>
+            <w:proofErr w:type="spellEnd"/>
+            <w:r>
+              <w:rPr>
+                <w:b/>
+                <w:bCs/>
+                <w:color w:val="FFFFFF"/>
+                <w:sz w:val="20"/>
+                <w:szCs w:val="20"/>
+              </w:rPr>
+              <w:t xml:space="preserve"> 범위</w:t>
             </w:r>
           </w:p>
         </w:tc>
@@ -3187,7 +3562,25 @@
           <w:sz w:val="18"/>
           <w:szCs w:val="18"/>
         </w:rPr>
-        <w:t>Template · CAIO 과정 · 장동인 (Dong In Chang)</w:t>
+        <w:t xml:space="preserve">Template · CAIO 과정 · </w:t>
+      </w:r>
+      <w:proofErr w:type="spellStart"/>
+      <w:r>
+        <w:rPr>
+          <w:color w:val="7F8FA9"/>
+          <w:sz w:val="18"/>
+          <w:szCs w:val="18"/>
+        </w:rPr>
+        <w:t>장동인</w:t>
+      </w:r>
+      <w:proofErr w:type="spellEnd"/>
+      <w:r>
+        <w:rPr>
+          <w:color w:val="7F8FA9"/>
+          <w:sz w:val="18"/>
+          <w:szCs w:val="18"/>
+        </w:rPr>
+        <w:t xml:space="preserve"> (Dong In Chang)</w:t>
       </w:r>
     </w:p>
     <w:sectPr>

</xml_diff>